<commit_message>
Deutsch 7A: Hilfsverben-Stunde ohne Präsentation
Merksätze und Übungen stehen an der Tafel, Präsentation entfernt.
Merksatz 5 und 6 nennen jetzt ausdrücklich, dass man Partizip II und
Hilfsverben für die Tempora braucht. CLAUDE.md: PowerPoint nur nach
Rückfrage.

Co-Authored-By: Claude Opus 5.5 <noreply@anthropic.com>
Claude-Session: https://claude.ai/code/session_01KXvLXHMYPnCyEbMRgNaaYs
</commit_message>
<xml_diff>
--- a/Deutsch_7A/Hilfsverben_erkennen/Tafelskript_Hilfsverben_erkennen.docx
+++ b/Deutsch_7A/Hilfsverben_erkennen/Tafelskript_Hilfsverben_erkennen.docx
@@ -483,7 +483,7 @@
                 <w:sz w:val="21"/>
                 <w:szCs w:val="21"/>
               </w:rPr>
-              <w:t xml:space="preserve">Merksatz 5 von der Folie nachholen</w:t>
+              <w:t xml:space="preserve">Merksatz 5 von der Tafel nachholen</w:t>
             </w:r>
           </w:p>
         </w:tc>
@@ -1323,6 +1323,31 @@
           <w:sz w:val="21"/>
           <w:szCs w:val="21"/>
         </w:rPr>
+        <w:t xml:space="preserve">Tipp: </w:t>
+      </w:r>
+      <w:r>
+        <w:rPr>
+          <w:rFonts w:ascii="Calibri" w:cs="Calibri" w:eastAsia="Calibri" w:hAnsi="Calibri"/>
+          <w:color w:val="000000"/>
+          <w:sz w:val="21"/>
+          <w:szCs w:val="21"/>
+        </w:rPr>
+        <w:t xml:space="preserve">Die drei Merksätze vor der Stunde auf die Seitentafel schreiben und zuklappen. Dann kostet das Anschreiben in der Stunde keine Zeit, und Sie klappen jeweils nur den nächsten Merksatz auf.</w:t>
+      </w:r>
+    </w:p>
+    <w:p>
+      <w:pPr>
+        <w:spacing w:after="40" w:before="0"/>
+      </w:pPr>
+      <w:r>
+        <w:rPr>
+          <w:rFonts w:ascii="Calibri" w:cs="Calibri" w:eastAsia="Calibri" w:hAnsi="Calibri"/>
+          <w:b/>
+          <w:bCs/>
+          <w:color w:val="000000"/>
+          <w:sz w:val="21"/>
+          <w:szCs w:val="21"/>
+        </w:rPr>
         <w:t xml:space="preserve">Material: </w:t>
       </w:r>
       <w:r>
@@ -1332,7 +1357,7 @@
           <w:sz w:val="21"/>
           <w:szCs w:val="21"/>
         </w:rPr>
-        <w:t xml:space="preserve">Präsentation „Hilfsverben erkennen“ · Kreide Rot und Gelb · Schüler: Heft, Lineal, Buntstifte Rot und Gelb, kleiner Zettel für das Exit-Ticket</w:t>
+        <w:t xml:space="preserve">Kreide Rot und Gelb · Schüler: Heft, Lineal, Buntstifte Rot und Gelb, kleiner Zettel für das Exit-Ticket</w:t>
       </w:r>
     </w:p>
     <w:p>
@@ -2559,7 +2584,7 @@
                 <w:sz w:val="21"/>
                 <w:szCs w:val="21"/>
               </w:rPr>
-              <w:t xml:space="preserve">„Heft auf. Datum nach rechts. Neue Überschrift: Hilfsverben erkennen. Mit Lineal unterstreichen. Dann schreibt ihr von der Folie ab: Merksatz 5. Rot umrahmen.“</w:t>
+              <w:t xml:space="preserve">„Heft auf. Datum nach rechts. Neue Überschrift: Hilfsverben erkennen. Mit Lineal unterstreichen. Dann schreibt ihr von der Tafel ab: Merksatz 5. Rot umrahmen.“</w:t>
             </w:r>
           </w:p>
           <w:p>
@@ -2573,7 +2598,7 @@
                 <w:sz w:val="21"/>
                 <w:szCs w:val="21"/>
               </w:rPr>
-              <w:t xml:space="preserve">„Aber nie allein“ bewusst stehen lassen – genau das ist die Brücke zu Phase 2.</w:t>
+              <w:t xml:space="preserve">„Für die Tempora – aber nie allein“ bewusst stehen lassen: Das ist die Brücke zu Phase 2. Welches Verb hilft, erarbeitet die Klasse gleich selbst.</w:t>
             </w:r>
           </w:p>
           <w:tbl>
@@ -2599,12 +2624,12 @@
                 <w:tcPr>
                   <w:tcW w:type="dxa" w:w="8166"/>
                   <w:tcBorders>
-                    <w:top w:val="single" w:color="1E2761" w:sz="12"/>
-                    <w:left w:val="single" w:color="1E2761" w:sz="12"/>
-                    <w:bottom w:val="single" w:color="1E2761" w:sz="12"/>
-                    <w:right w:val="single" w:color="1E2761" w:sz="12"/>
+                    <w:top w:val="single" w:color="3D4A3F" w:sz="12"/>
+                    <w:left w:val="single" w:color="3D4A3F" w:sz="12"/>
+                    <w:bottom w:val="single" w:color="3D4A3F" w:sz="12"/>
+                    <w:right w:val="single" w:color="3D4A3F" w:sz="12"/>
                   </w:tcBorders>
-                  <w:shd w:fill="1E2761" w:color="auto" w:val="clear"/>
+                  <w:shd w:fill="3D4A3F" w:color="auto" w:val="clear"/>
                   <w:tcMar>
                     <w:top w:type="dxa" w:w="30"/>
                     <w:left w:type="dxa" w:w="100"/>
@@ -2626,7 +2651,7 @@
                       <w:sz w:val="16"/>
                       <w:szCs w:val="16"/>
                     </w:rPr>
-                    <w:t xml:space="preserve">FOLIE · Merksatz 5 – abschreiben, rot umrahmen</w:t>
+                    <w:t xml:space="preserve">TAFEL · Merksatz 5 – abschreiben, rot umrahmen</w:t>
                   </w:r>
                 </w:p>
               </w:tc>
@@ -2639,12 +2664,12 @@
                 <w:tcPr>
                   <w:tcW w:type="dxa" w:w="8166"/>
                   <w:tcBorders>
-                    <w:top w:val="single" w:color="1E2761" w:sz="12"/>
-                    <w:left w:val="single" w:color="1E2761" w:sz="12"/>
-                    <w:bottom w:val="single" w:color="1E2761" w:sz="12"/>
-                    <w:right w:val="single" w:color="1E2761" w:sz="12"/>
+                    <w:top w:val="single" w:color="3D4A3F" w:sz="12"/>
+                    <w:left w:val="single" w:color="3D4A3F" w:sz="12"/>
+                    <w:bottom w:val="single" w:color="3D4A3F" w:sz="12"/>
+                    <w:right w:val="single" w:color="3D4A3F" w:sz="12"/>
                   </w:tcBorders>
-                  <w:shd w:fill="F4F7FD" w:color="auto" w:val="clear"/>
+                  <w:shd w:fill="F3F6F1" w:color="auto" w:val="clear"/>
                   <w:tcMar>
                     <w:top w:type="dxa" w:w="100"/>
                     <w:left w:type="dxa" w:w="160"/>
@@ -2720,7 +2745,27 @@
                       <w:sz w:val="21"/>
                       <w:szCs w:val="21"/>
                     </w:rPr>
-                    <w:t xml:space="preserve">Mit dem Partizip II erzählt man, was schon passiert ist – aber nie allein. </w:t>
+                    <w:t xml:space="preserve">Das Partizip II braucht man für die </w:t>
+                  </w:r>
+                  <w:r>
+                    <w:rPr>
+                      <w:rFonts w:ascii="Calibri" w:cs="Calibri" w:eastAsia="Calibri" w:hAnsi="Calibri"/>
+                      <w:b/>
+                      <w:bCs/>
+                      <w:color w:val="000000"/>
+                      <w:sz w:val="21"/>
+                      <w:szCs w:val="21"/>
+                    </w:rPr>
+                    <w:t xml:space="preserve">Tempora</w:t>
+                  </w:r>
+                  <w:r>
+                    <w:rPr>
+                      <w:rFonts w:ascii="Calibri" w:cs="Calibri" w:eastAsia="Calibri" w:hAnsi="Calibri"/>
+                      <w:color w:val="000000"/>
+                      <w:sz w:val="21"/>
+                      <w:szCs w:val="21"/>
+                    </w:rPr>
+                    <w:t xml:space="preserve"> (Zeitformen) – aber nie allein, sondern immer zusammen mit einem anderen Verb: Ich habe gespielt. </w:t>
                   </w:r>
                   <w:r>
                     <w:rPr>
@@ -4023,7 +4068,7 @@
                 <w:sz w:val="21"/>
                 <w:szCs w:val="21"/>
               </w:rPr>
-              <w:t xml:space="preserve">„Jetzt schreibt ihr von der Folie ab: Merksatz 6 mit dem Beispielsatz. Zeichnet die Klammer ein.“</w:t>
+              <w:t xml:space="preserve">„Jetzt schreibt ihr von der Tafel ab: Merksatz 6 mit dem Beispielsatz. Zeichnet die Klammer ein.“</w:t>
             </w:r>
           </w:p>
           <w:tbl>
@@ -4049,12 +4094,12 @@
                 <w:tcPr>
                   <w:tcW w:type="dxa" w:w="8166"/>
                   <w:tcBorders>
-                    <w:top w:val="single" w:color="1E2761" w:sz="12"/>
-                    <w:left w:val="single" w:color="1E2761" w:sz="12"/>
-                    <w:bottom w:val="single" w:color="1E2761" w:sz="12"/>
-                    <w:right w:val="single" w:color="1E2761" w:sz="12"/>
+                    <w:top w:val="single" w:color="3D4A3F" w:sz="12"/>
+                    <w:left w:val="single" w:color="3D4A3F" w:sz="12"/>
+                    <w:bottom w:val="single" w:color="3D4A3F" w:sz="12"/>
+                    <w:right w:val="single" w:color="3D4A3F" w:sz="12"/>
                   </w:tcBorders>
-                  <w:shd w:fill="1E2761" w:color="auto" w:val="clear"/>
+                  <w:shd w:fill="3D4A3F" w:color="auto" w:val="clear"/>
                   <w:tcMar>
                     <w:top w:type="dxa" w:w="30"/>
                     <w:left w:type="dxa" w:w="100"/>
@@ -4076,7 +4121,7 @@
                       <w:sz w:val="16"/>
                       <w:szCs w:val="16"/>
                     </w:rPr>
-                    <w:t xml:space="preserve">FOLIE · Merksatz 6 – abschreiben, rot umrahmen</w:t>
+                    <w:t xml:space="preserve">TAFEL · Merksatz 6 – abschreiben, rot umrahmen</w:t>
                   </w:r>
                 </w:p>
               </w:tc>
@@ -4089,12 +4134,12 @@
                 <w:tcPr>
                   <w:tcW w:type="dxa" w:w="8166"/>
                   <w:tcBorders>
-                    <w:top w:val="single" w:color="1E2761" w:sz="12"/>
-                    <w:left w:val="single" w:color="1E2761" w:sz="12"/>
-                    <w:bottom w:val="single" w:color="1E2761" w:sz="12"/>
-                    <w:right w:val="single" w:color="1E2761" w:sz="12"/>
+                    <w:top w:val="single" w:color="3D4A3F" w:sz="12"/>
+                    <w:left w:val="single" w:color="3D4A3F" w:sz="12"/>
+                    <w:bottom w:val="single" w:color="3D4A3F" w:sz="12"/>
+                    <w:right w:val="single" w:color="3D4A3F" w:sz="12"/>
                   </w:tcBorders>
-                  <w:shd w:fill="F4F7FD" w:color="auto" w:val="clear"/>
+                  <w:shd w:fill="F3F6F1" w:color="auto" w:val="clear"/>
                   <w:tcMar>
                     <w:top w:type="dxa" w:w="100"/>
                     <w:left w:type="dxa" w:w="160"/>
@@ -4210,7 +4255,27 @@
                       <w:sz w:val="21"/>
                       <w:szCs w:val="21"/>
                     </w:rPr>
-                    <w:t xml:space="preserve">Das Partizip II kann nicht zeigen, wer etwas tut – das übernimmt das Hilfsverb. Zusammen bilden sie Zeitformen. </w:t>
+                    <w:t xml:space="preserve">Hilfsverben braucht man für die </w:t>
+                  </w:r>
+                  <w:r>
+                    <w:rPr>
+                      <w:rFonts w:ascii="Calibri" w:cs="Calibri" w:eastAsia="Calibri" w:hAnsi="Calibri"/>
+                      <w:b/>
+                      <w:bCs/>
+                      <w:color w:val="000000"/>
+                      <w:sz w:val="21"/>
+                      <w:szCs w:val="21"/>
+                    </w:rPr>
+                    <w:t xml:space="preserve">Tempora</w:t>
+                  </w:r>
+                  <w:r>
+                    <w:rPr>
+                      <w:rFonts w:ascii="Calibri" w:cs="Calibri" w:eastAsia="Calibri" w:hAnsi="Calibri"/>
+                      <w:color w:val="000000"/>
+                      <w:sz w:val="21"/>
+                      <w:szCs w:val="21"/>
+                    </w:rPr>
+                    <w:t xml:space="preserve"> (Zeitformen). Das Partizip II kann nicht zeigen, wer etwas tut – das übernimmt das Hilfsverb. Zusammen bilden sie die Zeitform. </w:t>
                   </w:r>
                   <w:r>
                     <w:rPr>
@@ -4377,7 +4442,7 @@
                 <w:sz w:val="21"/>
                 <w:szCs w:val="21"/>
               </w:rPr>
-              <w:t xml:space="preserve">„Jetzt arbeitet ihr allein. Die Aufgabe steht auf der Folie: Ü6. Ihr schreibt die Sätze nicht ab – nur Nummer, Hilfsverb und Partizip II. Vier Minuten.“</w:t>
+              <w:t xml:space="preserve">„Jetzt arbeitet ihr allein. Die Aufgabe steht rechts an der Tafel: Ü6. Ihr schreibt die Sätze nicht ab – nur Nummer, Hilfsverb und Partizip II. Vier Minuten.“</w:t>
             </w:r>
           </w:p>
           <w:tbl>
@@ -4869,7 +4934,7 @@
                 <w:sz w:val="21"/>
                 <w:szCs w:val="21"/>
               </w:rPr>
-              <w:t xml:space="preserve">Die Sätze von Ü6 stehen dafür rechts an der Tafel (oder auf der Folie, dann nur ansagen lassen).</w:t>
+              <w:t xml:space="preserve">Die Sätze von Ü6 stehen rechts an der Tafel.</w:t>
             </w:r>
           </w:p>
         </w:tc>
@@ -5494,7 +5559,7 @@
                 <w:sz w:val="21"/>
                 <w:szCs w:val="21"/>
               </w:rPr>
-              <w:t xml:space="preserve">„Jetzt schreibt ihr von der Folie ab: Merksatz 7 mit den beiden Beispielsätzen.“</w:t>
+              <w:t xml:space="preserve">„Jetzt schreibt ihr von der Tafel ab: Merksatz 7 mit den beiden Beispielsätzen.“</w:t>
             </w:r>
           </w:p>
           <w:tbl>
@@ -5520,12 +5585,12 @@
                 <w:tcPr>
                   <w:tcW w:type="dxa" w:w="8166"/>
                   <w:tcBorders>
-                    <w:top w:val="single" w:color="1E2761" w:sz="12"/>
-                    <w:left w:val="single" w:color="1E2761" w:sz="12"/>
-                    <w:bottom w:val="single" w:color="1E2761" w:sz="12"/>
-                    <w:right w:val="single" w:color="1E2761" w:sz="12"/>
+                    <w:top w:val="single" w:color="3D4A3F" w:sz="12"/>
+                    <w:left w:val="single" w:color="3D4A3F" w:sz="12"/>
+                    <w:bottom w:val="single" w:color="3D4A3F" w:sz="12"/>
+                    <w:right w:val="single" w:color="3D4A3F" w:sz="12"/>
                   </w:tcBorders>
-                  <w:shd w:fill="1E2761" w:color="auto" w:val="clear"/>
+                  <w:shd w:fill="3D4A3F" w:color="auto" w:val="clear"/>
                   <w:tcMar>
                     <w:top w:type="dxa" w:w="30"/>
                     <w:left w:type="dxa" w:w="100"/>
@@ -5547,7 +5612,7 @@
                       <w:sz w:val="16"/>
                       <w:szCs w:val="16"/>
                     </w:rPr>
-                    <w:t xml:space="preserve">FOLIE · Merksatz 7 – abschreiben, rot umrahmen</w:t>
+                    <w:t xml:space="preserve">TAFEL · Merksatz 7 – abschreiben, rot umrahmen</w:t>
                   </w:r>
                 </w:p>
               </w:tc>
@@ -5560,12 +5625,12 @@
                 <w:tcPr>
                   <w:tcW w:type="dxa" w:w="8166"/>
                   <w:tcBorders>
-                    <w:top w:val="single" w:color="1E2761" w:sz="12"/>
-                    <w:left w:val="single" w:color="1E2761" w:sz="12"/>
-                    <w:bottom w:val="single" w:color="1E2761" w:sz="12"/>
-                    <w:right w:val="single" w:color="1E2761" w:sz="12"/>
+                    <w:top w:val="single" w:color="3D4A3F" w:sz="12"/>
+                    <w:left w:val="single" w:color="3D4A3F" w:sz="12"/>
+                    <w:bottom w:val="single" w:color="3D4A3F" w:sz="12"/>
+                    <w:right w:val="single" w:color="3D4A3F" w:sz="12"/>
                   </w:tcBorders>
-                  <w:shd w:fill="F4F7FD" w:color="auto" w:val="clear"/>
+                  <w:shd w:fill="F3F6F1" w:color="auto" w:val="clear"/>
                   <w:tcMar>
                     <w:top w:type="dxa" w:w="100"/>
                     <w:left w:type="dxa" w:w="160"/>
@@ -6625,7 +6690,7 @@
                 <w:sz w:val="21"/>
                 <w:szCs w:val="21"/>
               </w:rPr>
-              <w:t xml:space="preserve">„Heft zu. Jetzt arbeitet ihr allein auf einem Zettel. Die Aufgabe steht auf der Folie. Vier Minuten.“</w:t>
+              <w:t xml:space="preserve">„Heft zu. Jetzt arbeitet ihr allein auf einem Zettel. Die Aufgabe steht rechts an der Tafel. Vier Minuten.“</w:t>
             </w:r>
           </w:p>
           <w:tbl>

</xml_diff>

<commit_message>
Deutsch 7A: Merksatz zur Satzklammer in der Hilfsverben-Stunde
Neuer Merksatz 7 „Die Satzklammer“ mit farbigem Beispiel und
gezeichnetem Bogen. Merksatz 6 auf das Hilfsverb gekürzt, Hilfsverb
oder Vollverb wird Merksatz 8. Reaktivierung auf 5 Minuten gekürzt.

Co-Authored-By: Claude Opus 5.5 <noreply@anthropic.com>
Claude-Session: https://claude.ai/code/session_01KXvLXHMYPnCyEbMRgNaaYs
</commit_message>
<xml_diff>
--- a/Deutsch_7A/Hilfsverben_erkennen/Tafelskript_Hilfsverben_erkennen.docx
+++ b/Deutsch_7A/Hilfsverben_erkennen/Tafelskript_Hilfsverben_erkennen.docx
@@ -307,7 +307,7 @@
                 <w:sz w:val="21"/>
                 <w:szCs w:val="21"/>
               </w:rPr>
-              <w:t xml:space="preserve">8′</w:t>
+              <w:t xml:space="preserve">5′</w:t>
             </w:r>
           </w:p>
         </w:tc>
@@ -523,7 +523,7 @@
                 <w:sz w:val="21"/>
                 <w:szCs w:val="21"/>
               </w:rPr>
-              <w:t xml:space="preserve">15′</w:t>
+              <w:t xml:space="preserve">18′</w:t>
             </w:r>
           </w:p>
         </w:tc>
@@ -557,7 +557,7 @@
                 <w:sz w:val="21"/>
                 <w:szCs w:val="21"/>
               </w:rPr>
-              <w:t xml:space="preserve">2 Das Hilfsverb</w:t>
+              <w:t xml:space="preserve">2 Hilfsverb und Satzklammer</w:t>
             </w:r>
           </w:p>
         </w:tc>
@@ -591,7 +591,7 @@
                 <w:sz w:val="21"/>
                 <w:szCs w:val="21"/>
               </w:rPr>
-              <w:t xml:space="preserve">„Ich Fußball gespielt.“ – Was fehlt? Hilfsverb erarbeiten, Merksatz 6, Ü6</w:t>
+              <w:t xml:space="preserve">„Ich Fußball gespielt.“ – Was fehlt? Hilfsverb erarbeiten, Merksatz 6 (Hilfsverb), Merksatz 7 (Satzklammer), Ü6</w:t>
             </w:r>
           </w:p>
         </w:tc>
@@ -699,7 +699,7 @@
                 <w:sz w:val="21"/>
                 <w:szCs w:val="21"/>
               </w:rPr>
-              <w:t xml:space="preserve">„Ich habe Hunger“ / „Ich habe gegessen“, Merksatz 7, Ü7</w:t>
+              <w:t xml:space="preserve">„Ich habe Hunger“ / „Ich habe gegessen“, Merksatz 8, Ü7</w:t>
             </w:r>
           </w:p>
         </w:tc>
@@ -1060,7 +1060,7 @@
                 <w:sz w:val="20"/>
                 <w:szCs w:val="20"/>
               </w:rPr>
-              <w:t xml:space="preserve">Das Hilfsverb + Beispielsatz mit Klammer</w:t>
+              <w:t xml:space="preserve">Das Hilfsverb</w:t>
             </w:r>
           </w:p>
         </w:tc>
@@ -1097,11 +1097,11 @@
                 <w:rFonts w:ascii="Calibri" w:cs="Calibri" w:eastAsia="Calibri" w:hAnsi="Calibri"/>
                 <w:b/>
                 <w:bCs/>
-                <w:color w:val="C77C12"/>
+                <w:color w:val="D9534F"/>
                 <w:sz w:val="20"/>
                 <w:szCs w:val="20"/>
               </w:rPr>
-              <w:t xml:space="preserve">Ü6</w:t>
+              <w:t xml:space="preserve">Merksatz 7</w:t>
             </w:r>
           </w:p>
         </w:tc>
@@ -1133,7 +1133,7 @@
                 <w:sz w:val="20"/>
                 <w:szCs w:val="20"/>
               </w:rPr>
-              <w:t xml:space="preserve">nur Nummer + Hilfsverb + Partizip II: 1 hat – gezockt …</w:t>
+              <w:t xml:space="preserve">Die Satzklammer + farbiger Beispielsatz mit Bogen</w:t>
             </w:r>
           </w:p>
         </w:tc>
@@ -1170,11 +1170,84 @@
                 <w:rFonts w:ascii="Calibri" w:cs="Calibri" w:eastAsia="Calibri" w:hAnsi="Calibri"/>
                 <w:b/>
                 <w:bCs/>
+                <w:color w:val="C77C12"/>
+                <w:sz w:val="20"/>
+                <w:szCs w:val="20"/>
+              </w:rPr>
+              <w:t xml:space="preserve">Ü6</w:t>
+            </w:r>
+          </w:p>
+        </w:tc>
+        <w:tc>
+          <w:tcPr>
+            <w:tcW w:type="dxa" w:w="7906"/>
+            <w:tcBorders>
+              <w:top w:val="single" w:color="B9C6E8" w:sz="6"/>
+              <w:left w:val="single" w:color="B9C6E8" w:sz="6"/>
+              <w:bottom w:val="single" w:color="B9C6E8" w:sz="6"/>
+              <w:right w:val="single" w:color="B9C6E8" w:sz="6"/>
+            </w:tcBorders>
+            <w:tcMar>
+              <w:top w:type="dxa" w:w="60"/>
+              <w:left w:type="dxa" w:w="100"/>
+              <w:bottom w:type="dxa" w:w="60"/>
+              <w:right w:type="dxa" w:w="100"/>
+            </w:tcMar>
+            <w:vAlign w:val="center"/>
+          </w:tcPr>
+          <w:p>
+            <w:pPr>
+              <w:spacing w:after="0" w:before="0"/>
+            </w:pPr>
+            <w:r>
+              <w:rPr>
+                <w:rFonts w:ascii="Calibri" w:cs="Calibri" w:eastAsia="Calibri" w:hAnsi="Calibri"/>
+                <w:color w:val="000000"/>
+                <w:sz w:val="20"/>
+                <w:szCs w:val="20"/>
+              </w:rPr>
+              <w:t xml:space="preserve">nur Nummer + Hilfsverb + Partizip II: 1 hat – gezockt …</w:t>
+            </w:r>
+          </w:p>
+        </w:tc>
+      </w:tr>
+      <w:tr>
+        <w:trPr>
+          <w:cantSplit/>
+          <w:trHeight w:val="360" w:hRule="atLeast"/>
+        </w:trPr>
+        <w:tc>
+          <w:tcPr>
+            <w:tcW w:type="dxa" w:w="2300"/>
+            <w:tcBorders>
+              <w:top w:val="single" w:color="B9C6E8" w:sz="6"/>
+              <w:left w:val="single" w:color="B9C6E8" w:sz="6"/>
+              <w:bottom w:val="single" w:color="B9C6E8" w:sz="6"/>
+              <w:right w:val="single" w:color="B9C6E8" w:sz="6"/>
+            </w:tcBorders>
+            <w:shd w:fill="F4F7FD" w:color="auto" w:val="clear"/>
+            <w:tcMar>
+              <w:top w:type="dxa" w:w="60"/>
+              <w:left w:type="dxa" w:w="100"/>
+              <w:bottom w:type="dxa" w:w="60"/>
+              <w:right w:type="dxa" w:w="100"/>
+            </w:tcMar>
+            <w:vAlign w:val="center"/>
+          </w:tcPr>
+          <w:p>
+            <w:pPr>
+              <w:spacing w:after="0" w:before="0"/>
+            </w:pPr>
+            <w:r>
+              <w:rPr>
+                <w:rFonts w:ascii="Calibri" w:cs="Calibri" w:eastAsia="Calibri" w:hAnsi="Calibri"/>
+                <w:b/>
+                <w:bCs/>
                 <w:color w:val="D9534F"/>
                 <w:sz w:val="20"/>
                 <w:szCs w:val="20"/>
               </w:rPr>
-              <w:t xml:space="preserve">Merksatz 7</w:t>
+              <w:t xml:space="preserve">Merksatz 8</w:t>
             </w:r>
           </w:p>
         </w:tc>
@@ -1332,7 +1405,7 @@
           <w:sz w:val="21"/>
           <w:szCs w:val="21"/>
         </w:rPr>
-        <w:t xml:space="preserve">Die drei Merksätze vor der Stunde auf die Seitentafel schreiben und zuklappen. Dann kostet das Anschreiben in der Stunde keine Zeit, und Sie klappen jeweils nur den nächsten Merksatz auf.</w:t>
+        <w:t xml:space="preserve">Die vier Merksätze vor der Stunde auf die Seitentafel schreiben und zuklappen. Dann kostet das Anschreiben in der Stunde keine Zeit, und Sie klappen jeweils nur den nächsten Merksatz auf.</w:t>
       </w:r>
     </w:p>
     <w:p>
@@ -1488,7 +1561,7 @@
           <w:sz w:val="20"/>
           <w:szCs w:val="20"/>
         </w:rPr>
-        <w:t xml:space="preserve">   8 Min.</w:t>
+        <w:t xml:space="preserve">   5 Min.</w:t>
       </w:r>
     </w:p>
     <w:tbl>
@@ -1931,7 +2004,7 @@
                       <w:sz w:val="22"/>
                       <w:szCs w:val="22"/>
                     </w:rPr>
-                    <w:t xml:space="preserve">spielen  ·  gespielt  ·  spielst  ·  war  ·  gegangen  ·  gehen  ·  hat  ·  gelesen  ·  lesen  ·  bist  ·  hatten  ·  gekauft</w:t>
+                    <w:t xml:space="preserve">spielen  ·  gespielt  ·  spielst  ·  war  ·  gegangen  ·  gehen  ·  hat  ·  bist  ·  gekauft</w:t>
                   </w:r>
                 </w:p>
                 <w:p>
@@ -2218,7 +2291,7 @@
                       <w:sz w:val="19"/>
                       <w:szCs w:val="19"/>
                     </w:rPr>
-                    <w:t xml:space="preserve">8 Minuten · Kreide-Kette</w:t>
+                    <w:t xml:space="preserve">5 Minuten · Kreide-Kette</w:t>
                   </w:r>
                   <w:r>
                     <w:rPr>
@@ -2271,7 +2344,7 @@
                 <w:sz w:val="19"/>
                 <w:szCs w:val="19"/>
               </w:rPr>
-              <w:t xml:space="preserve">Infinitiv: spielen, gehen, lesen · finit: spielst, war, hat, bist, hatten · Partizip II: gespielt, gegangen, gelesen, gekauft</w:t>
+              <w:t xml:space="preserve">Infinitiv: spielen, gehen · finit: spielst, war, hat, bist · Partizip II: gespielt, gegangen, gekauft</w:t>
             </w:r>
           </w:p>
         </w:tc>
@@ -2847,7 +2920,7 @@
           <w:sz w:val="28"/>
           <w:szCs w:val="28"/>
         </w:rPr>
-        <w:t xml:space="preserve">Das Hilfsverb</w:t>
+        <w:t xml:space="preserve">Hilfsverb und Satzklammer</w:t>
       </w:r>
       <w:r>
         <w:rPr>
@@ -2858,7 +2931,7 @@
           <w:sz w:val="20"/>
           <w:szCs w:val="20"/>
         </w:rPr>
-        <w:t xml:space="preserve">   15 Min.</w:t>
+        <w:t xml:space="preserve">   18 Min.</w:t>
       </w:r>
     </w:p>
     <w:tbl>
@@ -3910,7 +3983,7 @@
                 <w:sz w:val="21"/>
                 <w:szCs w:val="21"/>
               </w:rPr>
-              <w:t xml:space="preserve">Einen Bogen von jedem roten Wort zum gelben Partizip zeichnen: Die beiden bilden eine Klammer.</w:t>
+              <w:t xml:space="preserve">Einen Bogen von jedem roten Wort zum gelben Partizip zeichnen: Die beiden umschließen den Rest des Satzes wie eine Klammer. Den Begriff Satzklammer schon nennen – der Merksatz dazu folgt gleich nach dem Hilfsverb.</w:t>
             </w:r>
           </w:p>
           <w:p>
@@ -4068,7 +4141,7 @@
                 <w:sz w:val="21"/>
                 <w:szCs w:val="21"/>
               </w:rPr>
-              <w:t xml:space="preserve">„Jetzt schreibt ihr von der Tafel ab: Merksatz 6 mit dem Beispielsatz. Zeichnet die Klammer ein.“</w:t>
+              <w:t xml:space="preserve">„Jetzt schreibt ihr von der Tafel ab: Merksatz 6. Rot umrahmen.“</w:t>
             </w:r>
           </w:p>
           <w:tbl>
@@ -4215,7 +4288,7 @@
                       <w:sz w:val="21"/>
                       <w:szCs w:val="21"/>
                     </w:rPr>
-                    <w:t xml:space="preserve"> und steht an Position 2. Mit dem Partizip II am Satzende bildet es eine </w:t>
+                    <w:t xml:space="preserve"> und steht an Position 2. </w:t>
                   </w:r>
                   <w:r>
                     <w:rPr>
@@ -4226,7 +4299,7 @@
                       <w:sz w:val="21"/>
                       <w:szCs w:val="21"/>
                     </w:rPr>
-                    <w:t xml:space="preserve">Klammer</w:t>
+                    <w:t xml:space="preserve">Wofür? </w:t>
                   </w:r>
                   <w:r>
                     <w:rPr>
@@ -4235,7 +4308,7 @@
                       <w:sz w:val="21"/>
                       <w:szCs w:val="21"/>
                     </w:rPr>
-                    <w:t xml:space="preserve">. </w:t>
+                    <w:t xml:space="preserve">Hilfsverben braucht man für die </w:t>
                   </w:r>
                   <w:r>
                     <w:rPr>
@@ -4246,7 +4319,7 @@
                       <w:sz w:val="21"/>
                       <w:szCs w:val="21"/>
                     </w:rPr>
-                    <w:t xml:space="preserve">Wofür? </w:t>
+                    <w:t xml:space="preserve">Tempora</w:t>
                   </w:r>
                   <w:r>
                     <w:rPr>
@@ -4255,7 +4328,7 @@
                       <w:sz w:val="21"/>
                       <w:szCs w:val="21"/>
                     </w:rPr>
-                    <w:t xml:space="preserve">Hilfsverben braucht man für die </w:t>
+                    <w:t xml:space="preserve"> (Zeitformen). Das Partizip II kann nicht zeigen, wer etwas tut – das übernimmt das Hilfsverb. Zusammen bilden sie die Zeitform. </w:t>
                   </w:r>
                   <w:r>
                     <w:rPr>
@@ -4266,7 +4339,7 @@
                       <w:sz w:val="21"/>
                       <w:szCs w:val="21"/>
                     </w:rPr>
-                    <w:t xml:space="preserve">Tempora</w:t>
+                    <w:t xml:space="preserve">Test: </w:t>
                   </w:r>
                   <w:r>
                     <w:rPr>
@@ -4275,18 +4348,291 @@
                       <w:sz w:val="21"/>
                       <w:szCs w:val="21"/>
                     </w:rPr>
-                    <w:t xml:space="preserve"> (Zeitformen). Das Partizip II kann nicht zeigen, wer etwas tut – das übernimmt das Hilfsverb. Zusammen bilden sie die Zeitform. </w:t>
-                  </w:r>
+                    <w:t xml:space="preserve">Steht am Satzende ein Partizip II? Dann ist das finite haben oder sein davor ein Hilfsverb.</w:t>
+                  </w:r>
+                </w:p>
+              </w:tc>
+            </w:tr>
+          </w:tbl>
+          <w:p>
+            <w:pPr>
+              <w:spacing w:after="20" w:before="0"/>
+            </w:pPr>
+            <w:r>
+              <w:rPr>
+                <w:rFonts w:ascii="Calibri" w:cs="Calibri" w:eastAsia="Calibri" w:hAnsi="Calibri"/>
+                <w:color w:val="000000"/>
+                <w:sz w:val="22"/>
+                <w:szCs w:val="22"/>
+              </w:rPr>
+              <w:t xml:space="preserve"/>
+            </w:r>
+          </w:p>
+        </w:tc>
+      </w:tr>
+    </w:tbl>
+    <w:p>
+      <w:pPr>
+        <w:spacing w:after="40" w:before="0"/>
+      </w:pPr>
+      <w:r>
+        <w:rPr>
+          <w:rFonts w:ascii="Calibri" w:cs="Calibri" w:eastAsia="Calibri" w:hAnsi="Calibri"/>
+          <w:color w:val="000000"/>
+          <w:sz w:val="22"/>
+          <w:szCs w:val="22"/>
+        </w:rPr>
+        <w:t xml:space="preserve"/>
+      </w:r>
+    </w:p>
+    <w:tbl>
+      <w:tblPr>
+        <w:tblW w:type="dxa" w:w="10206"/>
+        <w:tblBorders>
+          <w:top w:val="single" w:color="auto" w:sz="4"/>
+          <w:left w:val="single" w:color="auto" w:sz="4"/>
+          <w:bottom w:val="single" w:color="auto" w:sz="4"/>
+          <w:right w:val="single" w:color="auto" w:sz="4"/>
+          <w:insideH w:val="single" w:color="auto" w:sz="4"/>
+          <w:insideV w:val="single" w:color="auto" w:sz="4"/>
+        </w:tblBorders>
+      </w:tblPr>
+      <w:tblGrid>
+        <w:gridCol w:w="1700"/>
+        <w:gridCol w:w="8506"/>
+      </w:tblGrid>
+      <w:tr>
+        <w:trPr>
+          <w:cantSplit/>
+        </w:trPr>
+        <w:tc>
+          <w:tcPr>
+            <w:tcW w:type="dxa" w:w="1700"/>
+            <w:tcBorders>
+              <w:top w:val="single" w:color="D5DDEE" w:sz="6"/>
+              <w:left w:val="single" w:color="D5DDEE" w:sz="6"/>
+              <w:bottom w:val="single" w:color="D5DDEE" w:sz="6"/>
+              <w:right w:val="single" w:color="D5DDEE" w:sz="6"/>
+            </w:tcBorders>
+            <w:shd w:fill="F4F7FD" w:color="auto" w:val="clear"/>
+            <w:tcMar>
+              <w:top w:type="dxa" w:w="100"/>
+              <w:left w:type="dxa" w:w="100"/>
+              <w:bottom w:type="dxa" w:w="100"/>
+              <w:right w:type="dxa" w:w="100"/>
+            </w:tcMar>
+            <w:vAlign w:val="top"/>
+          </w:tcPr>
+          <w:p>
+            <w:pPr>
+              <w:spacing w:after="10" w:before="0"/>
+            </w:pPr>
+            <w:r>
+              <w:rPr>
+                <w:rFonts w:ascii="Calibri" w:cs="Calibri" w:eastAsia="Calibri" w:hAnsi="Calibri"/>
+                <w:color w:val="5B6B8C"/>
+                <w:sz w:val="16"/>
+                <w:szCs w:val="16"/>
+              </w:rPr>
+              <w:t xml:space="preserve">Klasse</w:t>
+            </w:r>
+          </w:p>
+          <w:p>
+            <w:pPr>
+              <w:spacing w:after="0" w:before="0"/>
+            </w:pPr>
+            <w:r>
+              <w:rPr>
+                <w:rFonts w:ascii="Calibri" w:cs="Calibri" w:eastAsia="Calibri" w:hAnsi="Calibri"/>
+                <w:b/>
+                <w:bCs/>
+                <w:color w:val="1E2761"/>
+                <w:sz w:val="20"/>
+                <w:szCs w:val="20"/>
+              </w:rPr>
+              <w:t xml:space="preserve">schreibt ab</w:t>
+            </w:r>
+          </w:p>
+        </w:tc>
+        <w:tc>
+          <w:tcPr>
+            <w:tcW w:type="dxa" w:w="8506"/>
+            <w:tcBorders>
+              <w:top w:val="single" w:color="D5DDEE" w:sz="6"/>
+              <w:left w:val="single" w:color="D5DDEE" w:sz="6"/>
+              <w:bottom w:val="single" w:color="D5DDEE" w:sz="6"/>
+              <w:right w:val="single" w:color="D5DDEE" w:sz="6"/>
+            </w:tcBorders>
+            <w:tcMar>
+              <w:top w:type="dxa" w:w="100"/>
+              <w:left w:type="dxa" w:w="160"/>
+              <w:bottom w:type="dxa" w:w="100"/>
+              <w:right w:type="dxa" w:w="100"/>
+            </w:tcMar>
+            <w:vAlign w:val="top"/>
+          </w:tcPr>
+          <w:p>
+            <w:pPr>
+              <w:spacing w:after="60" w:before="0"/>
+            </w:pPr>
+            <w:r>
+              <w:rPr>
+                <w:rFonts w:ascii="Calibri" w:cs="Calibri" w:eastAsia="Calibri" w:hAnsi="Calibri"/>
+                <w:b/>
+                <w:bCs/>
+                <w:color w:val="D9534F"/>
+                <w:sz w:val="20"/>
+                <w:szCs w:val="20"/>
+              </w:rPr>
+              <w:t xml:space="preserve">Ansage: </w:t>
+            </w:r>
+            <w:r>
+              <w:rPr>
+                <w:rFonts w:ascii="Calibri" w:cs="Calibri" w:eastAsia="Calibri" w:hAnsi="Calibri"/>
+                <w:i/>
+                <w:iCs/>
+                <w:color w:val="000000"/>
+                <w:sz w:val="21"/>
+                <w:szCs w:val="21"/>
+              </w:rPr>
+              <w:t xml:space="preserve">„Jetzt schreibt ihr von der Tafel ab: Merksatz 7 mit dem Beispielsatz. Hilfsverb rot, Partizip gelb, darunter den Bogen. Rot umrahmen.“</w:t>
+            </w:r>
+          </w:p>
+          <w:p>
+            <w:pPr>
+              <w:spacing w:after="50" w:before="0"/>
+            </w:pPr>
+            <w:r>
+              <w:rPr>
+                <w:rFonts w:ascii="Calibri" w:cs="Calibri" w:eastAsia="Calibri" w:hAnsi="Calibri"/>
+                <w:color w:val="000000"/>
+                <w:sz w:val="21"/>
+                <w:szCs w:val="21"/>
+              </w:rPr>
+              <w:t xml:space="preserve">Das Beispiel hat bewusst ein langes Mittelfeld: So sieht man, dass die Klammer auch weit auseinanderliegende Teile verbindet.</w:t>
+            </w:r>
+          </w:p>
+          <w:p>
+            <w:pPr>
+              <w:spacing w:after="50" w:before="0"/>
+            </w:pPr>
+            <w:r>
+              <w:rPr>
+                <w:rFonts w:ascii="Calibri" w:cs="Calibri" w:eastAsia="Calibri" w:hAnsi="Calibri"/>
+                <w:color w:val="000000"/>
+                <w:sz w:val="21"/>
+                <w:szCs w:val="21"/>
+              </w:rPr>
+              <w:t xml:space="preserve">Auf der Tafel den Bogen unter dem Satz von habe bis gespielt zeichnen, darüber klein „Position 2“ und „Satzende“.</w:t>
+            </w:r>
+          </w:p>
+          <w:tbl>
+            <w:tblPr>
+              <w:tblW w:type="dxa" w:w="8166"/>
+              <w:tblBorders>
+                <w:top w:val="single" w:color="auto" w:sz="4"/>
+                <w:left w:val="single" w:color="auto" w:sz="4"/>
+                <w:bottom w:val="single" w:color="auto" w:sz="4"/>
+                <w:right w:val="single" w:color="auto" w:sz="4"/>
+                <w:insideH w:val="single" w:color="auto" w:sz="4"/>
+                <w:insideV w:val="single" w:color="auto" w:sz="4"/>
+              </w:tblBorders>
+            </w:tblPr>
+            <w:tblGrid>
+              <w:gridCol w:w="8166"/>
+            </w:tblGrid>
+            <w:tr>
+              <w:trPr>
+                <w:cantSplit/>
+              </w:trPr>
+              <w:tc>
+                <w:tcPr>
+                  <w:tcW w:type="dxa" w:w="8166"/>
+                  <w:tcBorders>
+                    <w:top w:val="single" w:color="3D4A3F" w:sz="12"/>
+                    <w:left w:val="single" w:color="3D4A3F" w:sz="12"/>
+                    <w:bottom w:val="single" w:color="3D4A3F" w:sz="12"/>
+                    <w:right w:val="single" w:color="3D4A3F" w:sz="12"/>
+                  </w:tcBorders>
+                  <w:shd w:fill="3D4A3F" w:color="auto" w:val="clear"/>
+                  <w:tcMar>
+                    <w:top w:type="dxa" w:w="30"/>
+                    <w:left w:type="dxa" w:w="100"/>
+                    <w:bottom w:type="dxa" w:w="30"/>
+                    <w:right w:type="dxa" w:w="100"/>
+                  </w:tcMar>
+                  <w:vAlign w:val="center"/>
+                </w:tcPr>
+                <w:p>
+                  <w:pPr>
+                    <w:spacing w:after="0" w:before="0"/>
+                  </w:pPr>
                   <w:r>
                     <w:rPr>
                       <w:rFonts w:ascii="Calibri" w:cs="Calibri" w:eastAsia="Calibri" w:hAnsi="Calibri"/>
                       <w:b/>
                       <w:bCs/>
+                      <w:color w:val="FFFFFF"/>
+                      <w:sz w:val="16"/>
+                      <w:szCs w:val="16"/>
+                    </w:rPr>
+                    <w:t xml:space="preserve">TAFEL · Merksatz 7 – abschreiben, rot umrahmen</w:t>
+                  </w:r>
+                </w:p>
+              </w:tc>
+            </w:tr>
+            <w:tr>
+              <w:trPr>
+                <w:cantSplit/>
+              </w:trPr>
+              <w:tc>
+                <w:tcPr>
+                  <w:tcW w:type="dxa" w:w="8166"/>
+                  <w:tcBorders>
+                    <w:top w:val="single" w:color="3D4A3F" w:sz="12"/>
+                    <w:left w:val="single" w:color="3D4A3F" w:sz="12"/>
+                    <w:bottom w:val="single" w:color="3D4A3F" w:sz="12"/>
+                    <w:right w:val="single" w:color="3D4A3F" w:sz="12"/>
+                  </w:tcBorders>
+                  <w:shd w:fill="F3F6F1" w:color="auto" w:val="clear"/>
+                  <w:tcMar>
+                    <w:top w:type="dxa" w:w="100"/>
+                    <w:left w:type="dxa" w:w="160"/>
+                    <w:bottom w:type="dxa" w:w="100"/>
+                    <w:right w:type="dxa" w:w="100"/>
+                  </w:tcMar>
+                  <w:vAlign w:val="center"/>
+                </w:tcPr>
+                <w:p>
+                  <w:pPr>
+                    <w:spacing w:after="40" w:before="0"/>
+                  </w:pPr>
+                  <w:r>
+                    <w:rPr>
+                      <w:rFonts w:ascii="Cambria" w:cs="Cambria" w:eastAsia="Cambria" w:hAnsi="Cambria"/>
+                      <w:b/>
+                      <w:bCs/>
+                      <w:color w:val="D9534F"/>
+                      <w:sz w:val="22"/>
+                      <w:szCs w:val="22"/>
+                    </w:rPr>
+                    <w:t xml:space="preserve">Die Satzklammer</w:t>
+                  </w:r>
+                </w:p>
+                <w:p>
+                  <w:pPr>
+                    <w:spacing w:after="80" w:before="0"/>
+                  </w:pPr>
+                  <w:r>
+                    <w:rPr>
+                      <w:rFonts w:ascii="Calibri" w:cs="Calibri" w:eastAsia="Calibri" w:hAnsi="Calibri"/>
+                      <w:b/>
+                      <w:bCs/>
                       <w:color w:val="000000"/>
                       <w:sz w:val="21"/>
                       <w:szCs w:val="21"/>
                     </w:rPr>
-                    <w:t xml:space="preserve">Test: </w:t>
+                    <w:t xml:space="preserve">Die Satzklammer</w:t>
                   </w:r>
                   <w:r>
                     <w:rPr>
@@ -4295,7 +4641,576 @@
                       <w:sz w:val="21"/>
                       <w:szCs w:val="21"/>
                     </w:rPr>
-                    <w:t xml:space="preserve">Steht am Satzende ein Partizip II? Dann ist das finite haben oder sein davor ein Hilfsverb.</w:t>
+                    <w:t xml:space="preserve"> besteht aus dem </w:t>
+                  </w:r>
+                  <w:r>
+                    <w:rPr>
+                      <w:rFonts w:ascii="Calibri" w:cs="Calibri" w:eastAsia="Calibri" w:hAnsi="Calibri"/>
+                      <w:b/>
+                      <w:bCs/>
+                      <w:color w:val="000000"/>
+                      <w:sz w:val="21"/>
+                      <w:szCs w:val="21"/>
+                    </w:rPr>
+                    <w:t xml:space="preserve">finiten Verb an Position 2</w:t>
+                  </w:r>
+                  <w:r>
+                    <w:rPr>
+                      <w:rFonts w:ascii="Calibri" w:cs="Calibri" w:eastAsia="Calibri" w:hAnsi="Calibri"/>
+                      <w:color w:val="000000"/>
+                      <w:sz w:val="21"/>
+                      <w:szCs w:val="21"/>
+                    </w:rPr>
+                    <w:t xml:space="preserve"> und dem </w:t>
+                  </w:r>
+                  <w:r>
+                    <w:rPr>
+                      <w:rFonts w:ascii="Calibri" w:cs="Calibri" w:eastAsia="Calibri" w:hAnsi="Calibri"/>
+                      <w:b/>
+                      <w:bCs/>
+                      <w:color w:val="000000"/>
+                      <w:sz w:val="21"/>
+                      <w:szCs w:val="21"/>
+                    </w:rPr>
+                    <w:t xml:space="preserve">infiniten Teil am Satzende</w:t>
+                  </w:r>
+                  <w:r>
+                    <w:rPr>
+                      <w:rFonts w:ascii="Calibri" w:cs="Calibri" w:eastAsia="Calibri" w:hAnsi="Calibri"/>
+                      <w:color w:val="000000"/>
+                      <w:sz w:val="21"/>
+                      <w:szCs w:val="21"/>
+                    </w:rPr>
+                    <w:t xml:space="preserve">. Zusammen umschließen sie den Rest des Satzes.</w:t>
+                  </w:r>
+                </w:p>
+                <w:tbl>
+                  <w:tblPr>
+                    <w:tblW w:type="dxa" w:w="7750"/>
+                    <w:tblBorders>
+                      <w:top w:val="single" w:color="auto" w:sz="4"/>
+                      <w:left w:val="single" w:color="auto" w:sz="4"/>
+                      <w:bottom w:val="single" w:color="auto" w:sz="4"/>
+                      <w:right w:val="single" w:color="auto" w:sz="4"/>
+                      <w:insideH w:val="single" w:color="auto" w:sz="4"/>
+                      <w:insideV w:val="single" w:color="auto" w:sz="4"/>
+                    </w:tblBorders>
+                  </w:tblPr>
+                  <w:tblGrid>
+                    <w:gridCol w:w="600"/>
+                    <w:gridCol w:w="1150"/>
+                    <w:gridCol w:w="4550"/>
+                    <w:gridCol w:w="1450"/>
+                  </w:tblGrid>
+                  <w:tr>
+                    <w:trPr>
+                      <w:cantSplit/>
+                    </w:trPr>
+                    <w:tc>
+                      <w:tcPr>
+                        <w:tcW w:type="dxa" w:w="600"/>
+                        <w:tcBorders>
+                          <w:top w:val="none" w:color="FFFFFF" w:sz="0"/>
+                          <w:left w:val="none" w:color="FFFFFF" w:sz="0"/>
+                          <w:bottom w:val="none" w:color="FFFFFF" w:sz="0"/>
+                          <w:right w:val="none" w:color="FFFFFF" w:sz="0"/>
+                        </w:tcBorders>
+                        <w:tcMar>
+                          <w:top w:type="dxa" w:w="10"/>
+                          <w:left w:type="dxa" w:w="40"/>
+                          <w:bottom w:type="dxa" w:w="10"/>
+                          <w:right w:type="dxa" w:w="100"/>
+                        </w:tcMar>
+                        <w:vAlign w:val="center"/>
+                      </w:tcPr>
+                      <w:p>
+                        <w:pPr>
+                          <w:spacing w:after="0" w:before="0"/>
+                          <w:jc w:val="center"/>
+                        </w:pPr>
+                        <w:r>
+                          <w:rPr>
+                            <w:rFonts w:ascii="Cambria" w:cs="Cambria" w:eastAsia="Cambria" w:hAnsi="Cambria"/>
+                            <w:color w:val="000000"/>
+                            <w:sz w:val="22"/>
+                            <w:szCs w:val="22"/>
+                          </w:rPr>
+                          <w:t xml:space="preserve">Ich</w:t>
+                        </w:r>
+                      </w:p>
+                    </w:tc>
+                    <w:tc>
+                      <w:tcPr>
+                        <w:tcW w:type="dxa" w:w="1150"/>
+                        <w:tcBorders>
+                          <w:top w:val="none" w:color="FFFFFF" w:sz="0"/>
+                          <w:left w:val="none" w:color="FFFFFF" w:sz="0"/>
+                          <w:bottom w:val="none" w:color="FFFFFF" w:sz="0"/>
+                          <w:right w:val="none" w:color="FFFFFF" w:sz="0"/>
+                        </w:tcBorders>
+                        <w:tcMar>
+                          <w:top w:type="dxa" w:w="10"/>
+                          <w:left w:type="dxa" w:w="40"/>
+                          <w:bottom w:type="dxa" w:w="10"/>
+                          <w:right w:type="dxa" w:w="100"/>
+                        </w:tcMar>
+                        <w:vAlign w:val="center"/>
+                      </w:tcPr>
+                      <w:p>
+                        <w:pPr>
+                          <w:spacing w:after="0" w:before="0"/>
+                          <w:jc w:val="center"/>
+                        </w:pPr>
+                        <w:r>
+                          <w:rPr>
+                            <w:rFonts w:ascii="Cambria" w:cs="Cambria" w:eastAsia="Cambria" w:hAnsi="Cambria"/>
+                            <w:b/>
+                            <w:bCs/>
+                            <w:color w:val="D9534F"/>
+                            <w:sz w:val="22"/>
+                            <w:szCs w:val="22"/>
+                          </w:rPr>
+                          <w:t xml:space="preserve">habe</w:t>
+                        </w:r>
+                      </w:p>
+                    </w:tc>
+                    <w:tc>
+                      <w:tcPr>
+                        <w:tcW w:type="dxa" w:w="4550"/>
+                        <w:tcBorders>
+                          <w:top w:val="none" w:color="FFFFFF" w:sz="0"/>
+                          <w:left w:val="none" w:color="FFFFFF" w:sz="0"/>
+                          <w:bottom w:val="none" w:color="FFFFFF" w:sz="0"/>
+                          <w:right w:val="none" w:color="FFFFFF" w:sz="0"/>
+                        </w:tcBorders>
+                        <w:tcMar>
+                          <w:top w:type="dxa" w:w="10"/>
+                          <w:left w:type="dxa" w:w="40"/>
+                          <w:bottom w:type="dxa" w:w="10"/>
+                          <w:right w:type="dxa" w:w="100"/>
+                        </w:tcMar>
+                        <w:vAlign w:val="center"/>
+                      </w:tcPr>
+                      <w:p>
+                        <w:pPr>
+                          <w:spacing w:after="0" w:before="0"/>
+                          <w:jc w:val="center"/>
+                        </w:pPr>
+                        <w:r>
+                          <w:rPr>
+                            <w:rFonts w:ascii="Cambria" w:cs="Cambria" w:eastAsia="Cambria" w:hAnsi="Cambria"/>
+                            <w:color w:val="000000"/>
+                            <w:sz w:val="20"/>
+                            <w:szCs w:val="20"/>
+                          </w:rPr>
+                          <w:t xml:space="preserve">am Samstag mit meinem Bruder Fußball</w:t>
+                        </w:r>
+                      </w:p>
+                    </w:tc>
+                    <w:tc>
+                      <w:tcPr>
+                        <w:tcW w:type="dxa" w:w="1450"/>
+                        <w:tcBorders>
+                          <w:top w:val="none" w:color="FFFFFF" w:sz="0"/>
+                          <w:left w:val="none" w:color="FFFFFF" w:sz="0"/>
+                          <w:bottom w:val="none" w:color="FFFFFF" w:sz="0"/>
+                          <w:right w:val="none" w:color="FFFFFF" w:sz="0"/>
+                        </w:tcBorders>
+                        <w:tcMar>
+                          <w:top w:type="dxa" w:w="10"/>
+                          <w:left w:type="dxa" w:w="40"/>
+                          <w:bottom w:type="dxa" w:w="10"/>
+                          <w:right w:type="dxa" w:w="100"/>
+                        </w:tcMar>
+                        <w:vAlign w:val="center"/>
+                      </w:tcPr>
+                      <w:p>
+                        <w:pPr>
+                          <w:spacing w:after="0" w:before="0"/>
+                          <w:jc w:val="center"/>
+                        </w:pPr>
+                        <w:r>
+                          <w:rPr>
+                            <w:rFonts w:ascii="Cambria" w:cs="Cambria" w:eastAsia="Cambria" w:hAnsi="Cambria"/>
+                            <w:b/>
+                            <w:bCs/>
+                            <w:color w:val="C98A1E"/>
+                            <w:sz w:val="22"/>
+                            <w:szCs w:val="22"/>
+                          </w:rPr>
+                          <w:t xml:space="preserve">gespielt</w:t>
+                        </w:r>
+                        <w:r>
+                          <w:rPr>
+                            <w:rFonts w:ascii="Cambria" w:cs="Cambria" w:eastAsia="Cambria" w:hAnsi="Cambria"/>
+                            <w:color w:val="000000"/>
+                            <w:sz w:val="22"/>
+                            <w:szCs w:val="22"/>
+                          </w:rPr>
+                          <w:t xml:space="preserve">.</w:t>
+                        </w:r>
+                      </w:p>
+                    </w:tc>
+                  </w:tr>
+                  <w:tr>
+                    <w:trPr>
+                      <w:cantSplit/>
+                      <w:trHeight w:val="160" w:hRule="exact"/>
+                    </w:trPr>
+                    <w:tc>
+                      <w:tcPr>
+                        <w:tcW w:type="dxa" w:w="600"/>
+                        <w:tcBorders>
+                          <w:top w:val="none" w:color="FFFFFF" w:sz="0"/>
+                          <w:left w:val="none" w:color="FFFFFF" w:sz="0"/>
+                          <w:bottom w:val="none" w:color="FFFFFF" w:sz="0"/>
+                          <w:right w:val="none" w:color="FFFFFF" w:sz="0"/>
+                        </w:tcBorders>
+                        <w:tcMar>
+                          <w:top w:type="dxa" w:w="10"/>
+                          <w:left w:type="dxa" w:w="40"/>
+                          <w:bottom w:type="dxa" w:w="10"/>
+                          <w:right w:type="dxa" w:w="100"/>
+                        </w:tcMar>
+                        <w:vAlign w:val="center"/>
+                      </w:tcPr>
+                      <w:p>
+                        <w:pPr>
+                          <w:spacing w:after="0" w:before="0"/>
+                          <w:jc w:val="center"/>
+                        </w:pPr>
+                        <w:r>
+                          <w:rPr>
+                            <w:rFonts w:ascii="Calibri" w:cs="Calibri" w:eastAsia="Calibri" w:hAnsi="Calibri"/>
+                            <w:color w:val="000000"/>
+                            <w:sz w:val="22"/>
+                            <w:szCs w:val="22"/>
+                          </w:rPr>
+                          <w:t xml:space="preserve"/>
+                        </w:r>
+                      </w:p>
+                    </w:tc>
+                    <w:tc>
+                      <w:tcPr>
+                        <w:tcW w:type="dxa" w:w="1150"/>
+                        <w:tcBorders>
+                          <w:top w:val="none" w:color="FFFFFF" w:sz="0"/>
+                          <w:left w:val="single" w:color="1E2761" w:sz="12"/>
+                          <w:bottom w:val="single" w:color="1E2761" w:sz="12"/>
+                          <w:right w:val="none" w:color="FFFFFF" w:sz="0"/>
+                        </w:tcBorders>
+                        <w:tcMar>
+                          <w:top w:type="dxa" w:w="10"/>
+                          <w:left w:type="dxa" w:w="40"/>
+                          <w:bottom w:type="dxa" w:w="10"/>
+                          <w:right w:type="dxa" w:w="100"/>
+                        </w:tcMar>
+                        <w:vAlign w:val="center"/>
+                      </w:tcPr>
+                      <w:p>
+                        <w:pPr>
+                          <w:spacing w:after="0" w:before="0"/>
+                          <w:jc w:val="center"/>
+                        </w:pPr>
+                        <w:r>
+                          <w:rPr>
+                            <w:rFonts w:ascii="Calibri" w:cs="Calibri" w:eastAsia="Calibri" w:hAnsi="Calibri"/>
+                            <w:color w:val="000000"/>
+                            <w:sz w:val="22"/>
+                            <w:szCs w:val="22"/>
+                          </w:rPr>
+                          <w:t xml:space="preserve"/>
+                        </w:r>
+                      </w:p>
+                    </w:tc>
+                    <w:tc>
+                      <w:tcPr>
+                        <w:tcW w:type="dxa" w:w="4550"/>
+                        <w:tcBorders>
+                          <w:top w:val="none" w:color="FFFFFF" w:sz="0"/>
+                          <w:left w:val="none" w:color="FFFFFF" w:sz="0"/>
+                          <w:bottom w:val="single" w:color="1E2761" w:sz="12"/>
+                          <w:right w:val="none" w:color="FFFFFF" w:sz="0"/>
+                        </w:tcBorders>
+                        <w:tcMar>
+                          <w:top w:type="dxa" w:w="10"/>
+                          <w:left w:type="dxa" w:w="40"/>
+                          <w:bottom w:type="dxa" w:w="10"/>
+                          <w:right w:type="dxa" w:w="100"/>
+                        </w:tcMar>
+                        <w:vAlign w:val="center"/>
+                      </w:tcPr>
+                      <w:p>
+                        <w:pPr>
+                          <w:spacing w:after="0" w:before="0"/>
+                          <w:jc w:val="center"/>
+                        </w:pPr>
+                        <w:r>
+                          <w:rPr>
+                            <w:rFonts w:ascii="Calibri" w:cs="Calibri" w:eastAsia="Calibri" w:hAnsi="Calibri"/>
+                            <w:color w:val="000000"/>
+                            <w:sz w:val="22"/>
+                            <w:szCs w:val="22"/>
+                          </w:rPr>
+                          <w:t xml:space="preserve"/>
+                        </w:r>
+                      </w:p>
+                    </w:tc>
+                    <w:tc>
+                      <w:tcPr>
+                        <w:tcW w:type="dxa" w:w="1450"/>
+                        <w:tcBorders>
+                          <w:top w:val="none" w:color="FFFFFF" w:sz="0"/>
+                          <w:left w:val="none" w:color="FFFFFF" w:sz="0"/>
+                          <w:bottom w:val="single" w:color="1E2761" w:sz="12"/>
+                          <w:right w:val="single" w:color="1E2761" w:sz="12"/>
+                        </w:tcBorders>
+                        <w:tcMar>
+                          <w:top w:type="dxa" w:w="10"/>
+                          <w:left w:type="dxa" w:w="40"/>
+                          <w:bottom w:type="dxa" w:w="10"/>
+                          <w:right w:type="dxa" w:w="100"/>
+                        </w:tcMar>
+                        <w:vAlign w:val="center"/>
+                      </w:tcPr>
+                      <w:p>
+                        <w:pPr>
+                          <w:spacing w:after="0" w:before="0"/>
+                          <w:jc w:val="center"/>
+                        </w:pPr>
+                        <w:r>
+                          <w:rPr>
+                            <w:rFonts w:ascii="Calibri" w:cs="Calibri" w:eastAsia="Calibri" w:hAnsi="Calibri"/>
+                            <w:color w:val="000000"/>
+                            <w:sz w:val="22"/>
+                            <w:szCs w:val="22"/>
+                          </w:rPr>
+                          <w:t xml:space="preserve"/>
+                        </w:r>
+                      </w:p>
+                    </w:tc>
+                  </w:tr>
+                  <w:tr>
+                    <w:trPr>
+                      <w:cantSplit/>
+                    </w:trPr>
+                    <w:tc>
+                      <w:tcPr>
+                        <w:tcW w:type="dxa" w:w="600"/>
+                        <w:tcBorders>
+                          <w:top w:val="none" w:color="FFFFFF" w:sz="0"/>
+                          <w:left w:val="none" w:color="FFFFFF" w:sz="0"/>
+                          <w:bottom w:val="none" w:color="FFFFFF" w:sz="0"/>
+                          <w:right w:val="none" w:color="FFFFFF" w:sz="0"/>
+                        </w:tcBorders>
+                        <w:tcMar>
+                          <w:top w:type="dxa" w:w="10"/>
+                          <w:left w:type="dxa" w:w="40"/>
+                          <w:bottom w:type="dxa" w:w="10"/>
+                          <w:right w:type="dxa" w:w="100"/>
+                        </w:tcMar>
+                        <w:vAlign w:val="center"/>
+                      </w:tcPr>
+                      <w:p>
+                        <w:pPr>
+                          <w:spacing w:after="0" w:before="0"/>
+                          <w:jc w:val="center"/>
+                        </w:pPr>
+                        <w:r>
+                          <w:rPr>
+                            <w:rFonts w:ascii="Calibri" w:cs="Calibri" w:eastAsia="Calibri" w:hAnsi="Calibri"/>
+                            <w:color w:val="000000"/>
+                            <w:sz w:val="22"/>
+                            <w:szCs w:val="22"/>
+                          </w:rPr>
+                          <w:t xml:space="preserve"/>
+                        </w:r>
+                      </w:p>
+                    </w:tc>
+                    <w:tc>
+                      <w:tcPr>
+                        <w:tcW w:type="dxa" w:w="1150"/>
+                        <w:tcBorders>
+                          <w:top w:val="none" w:color="FFFFFF" w:sz="0"/>
+                          <w:left w:val="none" w:color="FFFFFF" w:sz="0"/>
+                          <w:bottom w:val="none" w:color="FFFFFF" w:sz="0"/>
+                          <w:right w:val="none" w:color="FFFFFF" w:sz="0"/>
+                        </w:tcBorders>
+                        <w:tcMar>
+                          <w:top w:type="dxa" w:w="10"/>
+                          <w:left w:type="dxa" w:w="40"/>
+                          <w:bottom w:type="dxa" w:w="10"/>
+                          <w:right w:type="dxa" w:w="100"/>
+                        </w:tcMar>
+                        <w:vAlign w:val="center"/>
+                      </w:tcPr>
+                      <w:p>
+                        <w:pPr>
+                          <w:spacing w:after="0" w:before="0"/>
+                          <w:jc w:val="center"/>
+                        </w:pPr>
+                        <w:r>
+                          <w:rPr>
+                            <w:rFonts w:ascii="Calibri" w:cs="Calibri" w:eastAsia="Calibri" w:hAnsi="Calibri"/>
+                            <w:i/>
+                            <w:iCs/>
+                            <w:color w:val="5B6B8C"/>
+                            <w:sz w:val="16"/>
+                            <w:szCs w:val="16"/>
+                          </w:rPr>
+                          <w:t xml:space="preserve">Position 2</w:t>
+                        </w:r>
+                      </w:p>
+                    </w:tc>
+                    <w:tc>
+                      <w:tcPr>
+                        <w:tcW w:type="dxa" w:w="4550"/>
+                        <w:tcBorders>
+                          <w:top w:val="none" w:color="FFFFFF" w:sz="0"/>
+                          <w:left w:val="none" w:color="FFFFFF" w:sz="0"/>
+                          <w:bottom w:val="none" w:color="FFFFFF" w:sz="0"/>
+                          <w:right w:val="none" w:color="FFFFFF" w:sz="0"/>
+                        </w:tcBorders>
+                        <w:tcMar>
+                          <w:top w:type="dxa" w:w="10"/>
+                          <w:left w:type="dxa" w:w="40"/>
+                          <w:bottom w:type="dxa" w:w="10"/>
+                          <w:right w:type="dxa" w:w="100"/>
+                        </w:tcMar>
+                        <w:vAlign w:val="center"/>
+                      </w:tcPr>
+                      <w:p>
+                        <w:pPr>
+                          <w:spacing w:after="0" w:before="0"/>
+                          <w:jc w:val="center"/>
+                        </w:pPr>
+                        <w:r>
+                          <w:rPr>
+                            <w:rFonts w:ascii="Calibri" w:cs="Calibri" w:eastAsia="Calibri" w:hAnsi="Calibri"/>
+                            <w:b/>
+                            <w:bCs/>
+                            <w:color w:val="1E2761"/>
+                            <w:sz w:val="17"/>
+                            <w:szCs w:val="17"/>
+                          </w:rPr>
+                          <w:t xml:space="preserve">Satzklammer</w:t>
+                        </w:r>
+                      </w:p>
+                    </w:tc>
+                    <w:tc>
+                      <w:tcPr>
+                        <w:tcW w:type="dxa" w:w="1450"/>
+                        <w:tcBorders>
+                          <w:top w:val="none" w:color="FFFFFF" w:sz="0"/>
+                          <w:left w:val="none" w:color="FFFFFF" w:sz="0"/>
+                          <w:bottom w:val="none" w:color="FFFFFF" w:sz="0"/>
+                          <w:right w:val="none" w:color="FFFFFF" w:sz="0"/>
+                        </w:tcBorders>
+                        <w:tcMar>
+                          <w:top w:type="dxa" w:w="10"/>
+                          <w:left w:type="dxa" w:w="40"/>
+                          <w:bottom w:type="dxa" w:w="10"/>
+                          <w:right w:type="dxa" w:w="100"/>
+                        </w:tcMar>
+                        <w:vAlign w:val="center"/>
+                      </w:tcPr>
+                      <w:p>
+                        <w:pPr>
+                          <w:spacing w:after="0" w:before="0"/>
+                          <w:jc w:val="center"/>
+                        </w:pPr>
+                        <w:r>
+                          <w:rPr>
+                            <w:rFonts w:ascii="Calibri" w:cs="Calibri" w:eastAsia="Calibri" w:hAnsi="Calibri"/>
+                            <w:i/>
+                            <w:iCs/>
+                            <w:color w:val="5B6B8C"/>
+                            <w:sz w:val="16"/>
+                            <w:szCs w:val="16"/>
+                          </w:rPr>
+                          <w:t xml:space="preserve">Satzende</w:t>
+                        </w:r>
+                      </w:p>
+                    </w:tc>
+                  </w:tr>
+                </w:tbl>
+                <w:p>
+                  <w:pPr>
+                    <w:spacing w:after="60" w:before="0"/>
+                  </w:pPr>
+                  <w:r>
+                    <w:rPr>
+                      <w:rFonts w:ascii="Calibri" w:cs="Calibri" w:eastAsia="Calibri" w:hAnsi="Calibri"/>
+                      <w:color w:val="000000"/>
+                      <w:sz w:val="22"/>
+                      <w:szCs w:val="22"/>
+                    </w:rPr>
+                    <w:t xml:space="preserve"/>
+                  </w:r>
+                </w:p>
+                <w:p>
+                  <w:pPr>
+                    <w:spacing w:after="0" w:before="0"/>
+                  </w:pPr>
+                  <w:r>
+                    <w:rPr>
+                      <w:rFonts w:ascii="Calibri" w:cs="Calibri" w:eastAsia="Calibri" w:hAnsi="Calibri"/>
+                      <w:b/>
+                      <w:bCs/>
+                      <w:color w:val="000000"/>
+                      <w:sz w:val="21"/>
+                      <w:szCs w:val="21"/>
+                    </w:rPr>
+                    <w:t xml:space="preserve">Wofür? </w:t>
+                  </w:r>
+                  <w:r>
+                    <w:rPr>
+                      <w:rFonts w:ascii="Calibri" w:cs="Calibri" w:eastAsia="Calibri" w:hAnsi="Calibri"/>
+                      <w:color w:val="000000"/>
+                      <w:sz w:val="21"/>
+                      <w:szCs w:val="21"/>
+                    </w:rPr>
+                    <w:t xml:space="preserve">Die Satzklammer braucht man für die </w:t>
+                  </w:r>
+                  <w:r>
+                    <w:rPr>
+                      <w:rFonts w:ascii="Calibri" w:cs="Calibri" w:eastAsia="Calibri" w:hAnsi="Calibri"/>
+                      <w:b/>
+                      <w:bCs/>
+                      <w:color w:val="000000"/>
+                      <w:sz w:val="21"/>
+                      <w:szCs w:val="21"/>
+                    </w:rPr>
+                    <w:t xml:space="preserve">Tempora</w:t>
+                  </w:r>
+                  <w:r>
+                    <w:rPr>
+                      <w:rFonts w:ascii="Calibri" w:cs="Calibri" w:eastAsia="Calibri" w:hAnsi="Calibri"/>
+                      <w:color w:val="000000"/>
+                      <w:sz w:val="21"/>
+                      <w:szCs w:val="21"/>
+                    </w:rPr>
+                    <w:t xml:space="preserve">: Am linken Teil erkennt man die Zeitform, am rechten den Partner. So findet man auch in langen Sätzen das ganze Prädikat. </w:t>
+                  </w:r>
+                  <w:r>
+                    <w:rPr>
+                      <w:rFonts w:ascii="Calibri" w:cs="Calibri" w:eastAsia="Calibri" w:hAnsi="Calibri"/>
+                      <w:b/>
+                      <w:bCs/>
+                      <w:color w:val="000000"/>
+                      <w:sz w:val="21"/>
+                      <w:szCs w:val="21"/>
+                    </w:rPr>
+                    <w:t xml:space="preserve">Test: </w:t>
+                  </w:r>
+                  <w:r>
+                    <w:rPr>
+                      <w:rFonts w:ascii="Calibri" w:cs="Calibri" w:eastAsia="Calibri" w:hAnsi="Calibri"/>
+                      <w:color w:val="000000"/>
+                      <w:sz w:val="21"/>
+                      <w:szCs w:val="21"/>
+                    </w:rPr>
+                    <w:t xml:space="preserve">Suche das finite Verb an Position 2. Suche dann am Satzende seinen Partner. Beide zusammen bilden die Satzklammer.</w:t>
                   </w:r>
                 </w:p>
               </w:tc>
@@ -5559,7 +6474,7 @@
                 <w:sz w:val="21"/>
                 <w:szCs w:val="21"/>
               </w:rPr>
-              <w:t xml:space="preserve">„Jetzt schreibt ihr von der Tafel ab: Merksatz 7 mit den beiden Beispielsätzen.“</w:t>
+              <w:t xml:space="preserve">„Jetzt schreibt ihr von der Tafel ab: Merksatz 8 mit den beiden Beispielsätzen.“</w:t>
             </w:r>
           </w:p>
           <w:tbl>
@@ -5612,7 +6527,7 @@
                       <w:sz w:val="16"/>
                       <w:szCs w:val="16"/>
                     </w:rPr>
-                    <w:t xml:space="preserve">TAFEL · Merksatz 7 – abschreiben, rot umrahmen</w:t>
+                    <w:t xml:space="preserve">TAFEL · Merksatz 8 – abschreiben, rot umrahmen</w:t>
                   </w:r>
                 </w:p>
               </w:tc>
@@ -7140,7 +8055,7 @@
                 <w:sz w:val="21"/>
                 <w:szCs w:val="21"/>
               </w:rPr>
-              <w:t xml:space="preserve">Auswertung: „ja“ bei 1 oder 3 → Hilfsverb und Vollverb noch verwechselt (Merksatz 7 in der nächsten Stunde kurz wiederholen). Die Erklärung zeigt, ob der Begriff sitzt – Voraussetzung für die Tempora.</w:t>
+              <w:t xml:space="preserve">Auswertung: „ja“ bei 1 oder 3 → Hilfsverb und Vollverb noch verwechselt (Merksatz 8 in der nächsten Stunde kurz wiederholen). Die Erklärung zeigt, ob der Begriff sitzt – Voraussetzung für die Tempora.</w:t>
             </w:r>
           </w:p>
         </w:tc>

</xml_diff>